<commit_message>
Creación de algunos procedimientos almacenados y creacion delarchivo README.md para un buen contexto del esquema y de la organización
</commit_message>
<xml_diff>
--- a/DOCUMENTS/AnálisisYSelecciónBaseDeDatos.docx
+++ b/DOCUMENTS/AnálisisYSelecciónBaseDeDatos.docx
@@ -408,14 +408,1147 @@
         <w:t>Universidad El Bosque</w:t>
       </w:r>
     </w:p>
+    <w:sdt>
+      <w:sdtPr>
+        <w:rPr>
+          <w:lang w:val="es-ES"/>
+        </w:rPr>
+        <w:id w:val="-1090160186"/>
+        <w:docPartObj>
+          <w:docPartGallery w:val="Table of Contents"/>
+          <w:docPartUnique/>
+        </w:docPartObj>
+      </w:sdtPr>
+      <w:sdtEndPr>
+        <w:rPr>
+          <w:rFonts w:asciiTheme="minorHAnsi" w:eastAsiaTheme="minorHAnsi" w:hAnsiTheme="minorHAnsi" w:cstheme="minorBidi"/>
+          <w:b/>
+          <w:bCs/>
+          <w:color w:val="auto"/>
+          <w:sz w:val="22"/>
+          <w:szCs w:val="22"/>
+          <w:lang w:eastAsia="en-US"/>
+        </w:rPr>
+      </w:sdtEndPr>
+      <w:sdtContent>
+        <w:p>
+          <w:pPr>
+            <w:pStyle w:val="TtuloTDC"/>
+          </w:pPr>
+          <w:r>
+            <w:rPr>
+              <w:lang w:val="es-ES"/>
+            </w:rPr>
+            <w:t>Contenido</w:t>
+          </w:r>
+        </w:p>
+        <w:p>
+          <w:pPr>
+            <w:pStyle w:val="TDC2"/>
+            <w:tabs>
+              <w:tab w:val="right" w:leader="dot" w:pos="8828"/>
+            </w:tabs>
+            <w:rPr>
+              <w:rFonts w:eastAsiaTheme="minorEastAsia"/>
+              <w:noProof/>
+              <w:kern w:val="2"/>
+              <w:sz w:val="24"/>
+              <w:szCs w:val="24"/>
+              <w:lang w:eastAsia="es-CO"/>
+              <w14:ligatures w14:val="standardContextual"/>
+            </w:rPr>
+          </w:pPr>
+          <w:r>
+            <w:fldChar w:fldCharType="begin"/>
+          </w:r>
+          <w:r>
+            <w:instrText xml:space="preserve"> TOC \o "1-3" \h \z \u </w:instrText>
+          </w:r>
+          <w:r>
+            <w:fldChar w:fldCharType="separate"/>
+          </w:r>
+          <w:hyperlink w:anchor="_Toc226225147" w:history="1">
+            <w:r>
+              <w:rPr>
+                <w:rStyle w:val="Hipervnculo"/>
+                <w:b/>
+                <w:bCs/>
+                <w:noProof/>
+              </w:rPr>
+              <w:t>Introducción al análisis de base de datos</w:t>
+            </w:r>
+            <w:r>
+              <w:rPr>
+                <w:noProof/>
+                <w:webHidden/>
+              </w:rPr>
+              <w:tab/>
+            </w:r>
+            <w:r>
+              <w:rPr>
+                <w:noProof/>
+                <w:webHidden/>
+              </w:rPr>
+              <w:fldChar w:fldCharType="begin"/>
+            </w:r>
+            <w:r>
+              <w:rPr>
+                <w:noProof/>
+                <w:webHidden/>
+              </w:rPr>
+              <w:instrText xml:space="preserve"> PAGEREF _Toc226225147 \h </w:instrText>
+            </w:r>
+            <w:r>
+              <w:rPr>
+                <w:noProof/>
+                <w:webHidden/>
+              </w:rPr>
+            </w:r>
+            <w:r>
+              <w:rPr>
+                <w:noProof/>
+                <w:webHidden/>
+              </w:rPr>
+              <w:fldChar w:fldCharType="separate"/>
+            </w:r>
+            <w:r>
+              <w:rPr>
+                <w:noProof/>
+                <w:webHidden/>
+              </w:rPr>
+              <w:t>3</w:t>
+            </w:r>
+            <w:r>
+              <w:rPr>
+                <w:noProof/>
+                <w:webHidden/>
+              </w:rPr>
+              <w:fldChar w:fldCharType="end"/>
+            </w:r>
+          </w:hyperlink>
+        </w:p>
+        <w:p>
+          <w:pPr>
+            <w:pStyle w:val="TDC2"/>
+            <w:tabs>
+              <w:tab w:val="right" w:leader="dot" w:pos="8828"/>
+            </w:tabs>
+            <w:rPr>
+              <w:rFonts w:eastAsiaTheme="minorEastAsia"/>
+              <w:noProof/>
+              <w:kern w:val="2"/>
+              <w:sz w:val="24"/>
+              <w:szCs w:val="24"/>
+              <w:lang w:eastAsia="es-CO"/>
+              <w14:ligatures w14:val="standardContextual"/>
+            </w:rPr>
+          </w:pPr>
+          <w:hyperlink w:anchor="_Toc226225148" w:history="1">
+            <w:r>
+              <w:rPr>
+                <w:rStyle w:val="Hipervnculo"/>
+                <w:b/>
+                <w:bCs/>
+                <w:noProof/>
+              </w:rPr>
+              <w:t>Requerimientos de datos del sistema</w:t>
+            </w:r>
+            <w:r>
+              <w:rPr>
+                <w:noProof/>
+                <w:webHidden/>
+              </w:rPr>
+              <w:tab/>
+            </w:r>
+            <w:r>
+              <w:rPr>
+                <w:noProof/>
+                <w:webHidden/>
+              </w:rPr>
+              <w:fldChar w:fldCharType="begin"/>
+            </w:r>
+            <w:r>
+              <w:rPr>
+                <w:noProof/>
+                <w:webHidden/>
+              </w:rPr>
+              <w:instrText xml:space="preserve"> PAGEREF _Toc226225148 \h </w:instrText>
+            </w:r>
+            <w:r>
+              <w:rPr>
+                <w:noProof/>
+                <w:webHidden/>
+              </w:rPr>
+            </w:r>
+            <w:r>
+              <w:rPr>
+                <w:noProof/>
+                <w:webHidden/>
+              </w:rPr>
+              <w:fldChar w:fldCharType="separate"/>
+            </w:r>
+            <w:r>
+              <w:rPr>
+                <w:noProof/>
+                <w:webHidden/>
+              </w:rPr>
+              <w:t>3</w:t>
+            </w:r>
+            <w:r>
+              <w:rPr>
+                <w:noProof/>
+                <w:webHidden/>
+              </w:rPr>
+              <w:fldChar w:fldCharType="end"/>
+            </w:r>
+          </w:hyperlink>
+        </w:p>
+        <w:p>
+          <w:pPr>
+            <w:pStyle w:val="TDC3"/>
+            <w:tabs>
+              <w:tab w:val="right" w:leader="dot" w:pos="8828"/>
+            </w:tabs>
+            <w:rPr>
+              <w:rFonts w:eastAsiaTheme="minorEastAsia"/>
+              <w:noProof/>
+              <w:kern w:val="2"/>
+              <w:sz w:val="24"/>
+              <w:szCs w:val="24"/>
+              <w:lang w:eastAsia="es-CO"/>
+              <w14:ligatures w14:val="standardContextual"/>
+            </w:rPr>
+          </w:pPr>
+          <w:hyperlink w:anchor="_Toc226225149" w:history="1">
+            <w:r>
+              <w:rPr>
+                <w:rStyle w:val="Hipervnculo"/>
+                <w:noProof/>
+              </w:rPr>
+              <w:t>PostgreSQL</w:t>
+            </w:r>
+            <w:r>
+              <w:rPr>
+                <w:noProof/>
+                <w:webHidden/>
+              </w:rPr>
+              <w:tab/>
+            </w:r>
+            <w:r>
+              <w:rPr>
+                <w:noProof/>
+                <w:webHidden/>
+              </w:rPr>
+              <w:fldChar w:fldCharType="begin"/>
+            </w:r>
+            <w:r>
+              <w:rPr>
+                <w:noProof/>
+                <w:webHidden/>
+              </w:rPr>
+              <w:instrText xml:space="preserve"> PAGEREF _Toc226225149 \h </w:instrText>
+            </w:r>
+            <w:r>
+              <w:rPr>
+                <w:noProof/>
+                <w:webHidden/>
+              </w:rPr>
+            </w:r>
+            <w:r>
+              <w:rPr>
+                <w:noProof/>
+                <w:webHidden/>
+              </w:rPr>
+              <w:fldChar w:fldCharType="separate"/>
+            </w:r>
+            <w:r>
+              <w:rPr>
+                <w:noProof/>
+                <w:webHidden/>
+              </w:rPr>
+              <w:t>4</w:t>
+            </w:r>
+            <w:r>
+              <w:rPr>
+                <w:noProof/>
+                <w:webHidden/>
+              </w:rPr>
+              <w:fldChar w:fldCharType="end"/>
+            </w:r>
+          </w:hyperlink>
+        </w:p>
+        <w:p>
+          <w:pPr>
+            <w:pStyle w:val="TDC3"/>
+            <w:tabs>
+              <w:tab w:val="right" w:leader="dot" w:pos="8828"/>
+            </w:tabs>
+            <w:rPr>
+              <w:rFonts w:eastAsiaTheme="minorEastAsia"/>
+              <w:noProof/>
+              <w:kern w:val="2"/>
+              <w:sz w:val="24"/>
+              <w:szCs w:val="24"/>
+              <w:lang w:eastAsia="es-CO"/>
+              <w14:ligatures w14:val="standardContextual"/>
+            </w:rPr>
+          </w:pPr>
+          <w:hyperlink w:anchor="_Toc226225150" w:history="1">
+            <w:r>
+              <w:rPr>
+                <w:rStyle w:val="Hipervnculo"/>
+                <w:noProof/>
+              </w:rPr>
+              <w:t>MySQL</w:t>
+            </w:r>
+            <w:r>
+              <w:rPr>
+                <w:noProof/>
+                <w:webHidden/>
+              </w:rPr>
+              <w:tab/>
+            </w:r>
+            <w:r>
+              <w:rPr>
+                <w:noProof/>
+                <w:webHidden/>
+              </w:rPr>
+              <w:fldChar w:fldCharType="begin"/>
+            </w:r>
+            <w:r>
+              <w:rPr>
+                <w:noProof/>
+                <w:webHidden/>
+              </w:rPr>
+              <w:instrText xml:space="preserve"> PAGEREF _Toc226225150 \h </w:instrText>
+            </w:r>
+            <w:r>
+              <w:rPr>
+                <w:noProof/>
+                <w:webHidden/>
+              </w:rPr>
+            </w:r>
+            <w:r>
+              <w:rPr>
+                <w:noProof/>
+                <w:webHidden/>
+              </w:rPr>
+              <w:fldChar w:fldCharType="separate"/>
+            </w:r>
+            <w:r>
+              <w:rPr>
+                <w:noProof/>
+                <w:webHidden/>
+              </w:rPr>
+              <w:t>4</w:t>
+            </w:r>
+            <w:r>
+              <w:rPr>
+                <w:noProof/>
+                <w:webHidden/>
+              </w:rPr>
+              <w:fldChar w:fldCharType="end"/>
+            </w:r>
+          </w:hyperlink>
+        </w:p>
+        <w:p>
+          <w:pPr>
+            <w:pStyle w:val="TDC3"/>
+            <w:tabs>
+              <w:tab w:val="right" w:leader="dot" w:pos="8828"/>
+            </w:tabs>
+            <w:rPr>
+              <w:rFonts w:eastAsiaTheme="minorEastAsia"/>
+              <w:noProof/>
+              <w:kern w:val="2"/>
+              <w:sz w:val="24"/>
+              <w:szCs w:val="24"/>
+              <w:lang w:eastAsia="es-CO"/>
+              <w14:ligatures w14:val="standardContextual"/>
+            </w:rPr>
+          </w:pPr>
+          <w:hyperlink w:anchor="_Toc226225151" w:history="1">
+            <w:r>
+              <w:rPr>
+                <w:rStyle w:val="Hipervnculo"/>
+                <w:noProof/>
+              </w:rPr>
+              <w:t>MariaDB</w:t>
+            </w:r>
+            <w:r>
+              <w:rPr>
+                <w:noProof/>
+                <w:webHidden/>
+              </w:rPr>
+              <w:tab/>
+            </w:r>
+            <w:r>
+              <w:rPr>
+                <w:noProof/>
+                <w:webHidden/>
+              </w:rPr>
+              <w:fldChar w:fldCharType="begin"/>
+            </w:r>
+            <w:r>
+              <w:rPr>
+                <w:noProof/>
+                <w:webHidden/>
+              </w:rPr>
+              <w:instrText xml:space="preserve"> PAGEREF _Toc226225151 \h </w:instrText>
+            </w:r>
+            <w:r>
+              <w:rPr>
+                <w:noProof/>
+                <w:webHidden/>
+              </w:rPr>
+            </w:r>
+            <w:r>
+              <w:rPr>
+                <w:noProof/>
+                <w:webHidden/>
+              </w:rPr>
+              <w:fldChar w:fldCharType="separate"/>
+            </w:r>
+            <w:r>
+              <w:rPr>
+                <w:noProof/>
+                <w:webHidden/>
+              </w:rPr>
+              <w:t>4</w:t>
+            </w:r>
+            <w:r>
+              <w:rPr>
+                <w:noProof/>
+                <w:webHidden/>
+              </w:rPr>
+              <w:fldChar w:fldCharType="end"/>
+            </w:r>
+          </w:hyperlink>
+        </w:p>
+        <w:p>
+          <w:pPr>
+            <w:pStyle w:val="TDC3"/>
+            <w:tabs>
+              <w:tab w:val="right" w:leader="dot" w:pos="8828"/>
+            </w:tabs>
+            <w:rPr>
+              <w:rFonts w:eastAsiaTheme="minorEastAsia"/>
+              <w:noProof/>
+              <w:kern w:val="2"/>
+              <w:sz w:val="24"/>
+              <w:szCs w:val="24"/>
+              <w:lang w:eastAsia="es-CO"/>
+              <w14:ligatures w14:val="standardContextual"/>
+            </w:rPr>
+          </w:pPr>
+          <w:hyperlink w:anchor="_Toc226225152" w:history="1">
+            <w:r>
+              <w:rPr>
+                <w:rStyle w:val="Hipervnculo"/>
+                <w:noProof/>
+              </w:rPr>
+              <w:t>MongoDB</w:t>
+            </w:r>
+            <w:r>
+              <w:rPr>
+                <w:noProof/>
+                <w:webHidden/>
+              </w:rPr>
+              <w:tab/>
+            </w:r>
+            <w:r>
+              <w:rPr>
+                <w:noProof/>
+                <w:webHidden/>
+              </w:rPr>
+              <w:fldChar w:fldCharType="begin"/>
+            </w:r>
+            <w:r>
+              <w:rPr>
+                <w:noProof/>
+                <w:webHidden/>
+              </w:rPr>
+              <w:instrText xml:space="preserve"> PAGEREF _Toc226225152 \h </w:instrText>
+            </w:r>
+            <w:r>
+              <w:rPr>
+                <w:noProof/>
+                <w:webHidden/>
+              </w:rPr>
+            </w:r>
+            <w:r>
+              <w:rPr>
+                <w:noProof/>
+                <w:webHidden/>
+              </w:rPr>
+              <w:fldChar w:fldCharType="separate"/>
+            </w:r>
+            <w:r>
+              <w:rPr>
+                <w:noProof/>
+                <w:webHidden/>
+              </w:rPr>
+              <w:t>5</w:t>
+            </w:r>
+            <w:r>
+              <w:rPr>
+                <w:noProof/>
+                <w:webHidden/>
+              </w:rPr>
+              <w:fldChar w:fldCharType="end"/>
+            </w:r>
+          </w:hyperlink>
+        </w:p>
+        <w:p>
+          <w:pPr>
+            <w:pStyle w:val="TDC3"/>
+            <w:tabs>
+              <w:tab w:val="right" w:leader="dot" w:pos="8828"/>
+            </w:tabs>
+            <w:rPr>
+              <w:rFonts w:eastAsiaTheme="minorEastAsia"/>
+              <w:noProof/>
+              <w:kern w:val="2"/>
+              <w:sz w:val="24"/>
+              <w:szCs w:val="24"/>
+              <w:lang w:eastAsia="es-CO"/>
+              <w14:ligatures w14:val="standardContextual"/>
+            </w:rPr>
+          </w:pPr>
+          <w:hyperlink w:anchor="_Toc226225153" w:history="1">
+            <w:r>
+              <w:rPr>
+                <w:rStyle w:val="Hipervnculo"/>
+                <w:noProof/>
+              </w:rPr>
+              <w:t>Oracle Database</w:t>
+            </w:r>
+            <w:r>
+              <w:rPr>
+                <w:noProof/>
+                <w:webHidden/>
+              </w:rPr>
+              <w:tab/>
+            </w:r>
+            <w:r>
+              <w:rPr>
+                <w:noProof/>
+                <w:webHidden/>
+              </w:rPr>
+              <w:fldChar w:fldCharType="begin"/>
+            </w:r>
+            <w:r>
+              <w:rPr>
+                <w:noProof/>
+                <w:webHidden/>
+              </w:rPr>
+              <w:instrText xml:space="preserve"> PAGEREF _Toc226225153 \h </w:instrText>
+            </w:r>
+            <w:r>
+              <w:rPr>
+                <w:noProof/>
+                <w:webHidden/>
+              </w:rPr>
+            </w:r>
+            <w:r>
+              <w:rPr>
+                <w:noProof/>
+                <w:webHidden/>
+              </w:rPr>
+              <w:fldChar w:fldCharType="separate"/>
+            </w:r>
+            <w:r>
+              <w:rPr>
+                <w:noProof/>
+                <w:webHidden/>
+              </w:rPr>
+              <w:t>5</w:t>
+            </w:r>
+            <w:r>
+              <w:rPr>
+                <w:noProof/>
+                <w:webHidden/>
+              </w:rPr>
+              <w:fldChar w:fldCharType="end"/>
+            </w:r>
+          </w:hyperlink>
+        </w:p>
+        <w:p>
+          <w:pPr>
+            <w:pStyle w:val="TDC3"/>
+            <w:tabs>
+              <w:tab w:val="right" w:leader="dot" w:pos="8828"/>
+            </w:tabs>
+            <w:rPr>
+              <w:rFonts w:eastAsiaTheme="minorEastAsia"/>
+              <w:noProof/>
+              <w:kern w:val="2"/>
+              <w:sz w:val="24"/>
+              <w:szCs w:val="24"/>
+              <w:lang w:eastAsia="es-CO"/>
+              <w14:ligatures w14:val="standardContextual"/>
+            </w:rPr>
+          </w:pPr>
+          <w:hyperlink w:anchor="_Toc226225154" w:history="1">
+            <w:r>
+              <w:rPr>
+                <w:rStyle w:val="Hipervnculo"/>
+                <w:noProof/>
+              </w:rPr>
+              <w:t>SQLite</w:t>
+            </w:r>
+            <w:r>
+              <w:rPr>
+                <w:noProof/>
+                <w:webHidden/>
+              </w:rPr>
+              <w:tab/>
+            </w:r>
+            <w:r>
+              <w:rPr>
+                <w:noProof/>
+                <w:webHidden/>
+              </w:rPr>
+              <w:fldChar w:fldCharType="begin"/>
+            </w:r>
+            <w:r>
+              <w:rPr>
+                <w:noProof/>
+                <w:webHidden/>
+              </w:rPr>
+              <w:instrText xml:space="preserve"> PAGEREF _Toc226225154 \h </w:instrText>
+            </w:r>
+            <w:r>
+              <w:rPr>
+                <w:noProof/>
+                <w:webHidden/>
+              </w:rPr>
+            </w:r>
+            <w:r>
+              <w:rPr>
+                <w:noProof/>
+                <w:webHidden/>
+              </w:rPr>
+              <w:fldChar w:fldCharType="separate"/>
+            </w:r>
+            <w:r>
+              <w:rPr>
+                <w:noProof/>
+                <w:webHidden/>
+              </w:rPr>
+              <w:t>5</w:t>
+            </w:r>
+            <w:r>
+              <w:rPr>
+                <w:noProof/>
+                <w:webHidden/>
+              </w:rPr>
+              <w:fldChar w:fldCharType="end"/>
+            </w:r>
+          </w:hyperlink>
+        </w:p>
+        <w:p>
+          <w:pPr>
+            <w:pStyle w:val="TDC2"/>
+            <w:tabs>
+              <w:tab w:val="right" w:leader="dot" w:pos="8828"/>
+            </w:tabs>
+            <w:rPr>
+              <w:rFonts w:eastAsiaTheme="minorEastAsia"/>
+              <w:noProof/>
+              <w:kern w:val="2"/>
+              <w:sz w:val="24"/>
+              <w:szCs w:val="24"/>
+              <w:lang w:eastAsia="es-CO"/>
+              <w14:ligatures w14:val="standardContextual"/>
+            </w:rPr>
+          </w:pPr>
+          <w:hyperlink w:anchor="_Toc226225155" w:history="1">
+            <w:r>
+              <w:rPr>
+                <w:rStyle w:val="Hipervnculo"/>
+                <w:b/>
+                <w:bCs/>
+                <w:noProof/>
+              </w:rPr>
+              <w:t>Matriz de comparación</w:t>
+            </w:r>
+            <w:r>
+              <w:rPr>
+                <w:noProof/>
+                <w:webHidden/>
+              </w:rPr>
+              <w:tab/>
+            </w:r>
+            <w:r>
+              <w:rPr>
+                <w:noProof/>
+                <w:webHidden/>
+              </w:rPr>
+              <w:fldChar w:fldCharType="begin"/>
+            </w:r>
+            <w:r>
+              <w:rPr>
+                <w:noProof/>
+                <w:webHidden/>
+              </w:rPr>
+              <w:instrText xml:space="preserve"> PAGEREF _Toc226225155 \h </w:instrText>
+            </w:r>
+            <w:r>
+              <w:rPr>
+                <w:noProof/>
+                <w:webHidden/>
+              </w:rPr>
+            </w:r>
+            <w:r>
+              <w:rPr>
+                <w:noProof/>
+                <w:webHidden/>
+              </w:rPr>
+              <w:fldChar w:fldCharType="separate"/>
+            </w:r>
+            <w:r>
+              <w:rPr>
+                <w:noProof/>
+                <w:webHidden/>
+              </w:rPr>
+              <w:t>6</w:t>
+            </w:r>
+            <w:r>
+              <w:rPr>
+                <w:noProof/>
+                <w:webHidden/>
+              </w:rPr>
+              <w:fldChar w:fldCharType="end"/>
+            </w:r>
+          </w:hyperlink>
+        </w:p>
+        <w:p>
+          <w:pPr>
+            <w:pStyle w:val="TDC2"/>
+            <w:tabs>
+              <w:tab w:val="right" w:leader="dot" w:pos="8828"/>
+            </w:tabs>
+            <w:rPr>
+              <w:rFonts w:eastAsiaTheme="minorEastAsia"/>
+              <w:noProof/>
+              <w:kern w:val="2"/>
+              <w:sz w:val="24"/>
+              <w:szCs w:val="24"/>
+              <w:lang w:eastAsia="es-CO"/>
+              <w14:ligatures w14:val="standardContextual"/>
+            </w:rPr>
+          </w:pPr>
+          <w:hyperlink w:anchor="_Toc226225156" w:history="1">
+            <w:r>
+              <w:rPr>
+                <w:rStyle w:val="Hipervnculo"/>
+                <w:b/>
+                <w:bCs/>
+                <w:noProof/>
+              </w:rPr>
+              <w:t>Selección de la base de datos</w:t>
+            </w:r>
+            <w:r>
+              <w:rPr>
+                <w:noProof/>
+                <w:webHidden/>
+              </w:rPr>
+              <w:tab/>
+            </w:r>
+            <w:r>
+              <w:rPr>
+                <w:noProof/>
+                <w:webHidden/>
+              </w:rPr>
+              <w:fldChar w:fldCharType="begin"/>
+            </w:r>
+            <w:r>
+              <w:rPr>
+                <w:noProof/>
+                <w:webHidden/>
+              </w:rPr>
+              <w:instrText xml:space="preserve"> PAGEREF _Toc226225156 \h </w:instrText>
+            </w:r>
+            <w:r>
+              <w:rPr>
+                <w:noProof/>
+                <w:webHidden/>
+              </w:rPr>
+            </w:r>
+            <w:r>
+              <w:rPr>
+                <w:noProof/>
+                <w:webHidden/>
+              </w:rPr>
+              <w:fldChar w:fldCharType="separate"/>
+            </w:r>
+            <w:r>
+              <w:rPr>
+                <w:noProof/>
+                <w:webHidden/>
+              </w:rPr>
+              <w:t>7</w:t>
+            </w:r>
+            <w:r>
+              <w:rPr>
+                <w:noProof/>
+                <w:webHidden/>
+              </w:rPr>
+              <w:fldChar w:fldCharType="end"/>
+            </w:r>
+          </w:hyperlink>
+        </w:p>
+        <w:p>
+          <w:pPr>
+            <w:pStyle w:val="TDC3"/>
+            <w:tabs>
+              <w:tab w:val="right" w:leader="dot" w:pos="8828"/>
+            </w:tabs>
+            <w:rPr>
+              <w:rFonts w:eastAsiaTheme="minorEastAsia"/>
+              <w:noProof/>
+              <w:kern w:val="2"/>
+              <w:sz w:val="24"/>
+              <w:szCs w:val="24"/>
+              <w:lang w:eastAsia="es-CO"/>
+              <w14:ligatures w14:val="standardContextual"/>
+            </w:rPr>
+          </w:pPr>
+          <w:hyperlink w:anchor="_Toc226225157" w:history="1">
+            <w:r>
+              <w:rPr>
+                <w:rStyle w:val="Hipervnculo"/>
+                <w:rFonts w:asciiTheme="majorHAnsi" w:hAnsiTheme="majorHAnsi"/>
+                <w:b/>
+                <w:bCs/>
+                <w:noProof/>
+              </w:rPr>
+              <w:t>Características de elección de PostgreSQL</w:t>
+            </w:r>
+            <w:r>
+              <w:rPr>
+                <w:noProof/>
+                <w:webHidden/>
+              </w:rPr>
+              <w:tab/>
+            </w:r>
+            <w:r>
+              <w:rPr>
+                <w:noProof/>
+                <w:webHidden/>
+              </w:rPr>
+              <w:fldChar w:fldCharType="begin"/>
+            </w:r>
+            <w:r>
+              <w:rPr>
+                <w:noProof/>
+                <w:webHidden/>
+              </w:rPr>
+              <w:instrText xml:space="preserve"> PAGEREF _Toc226225157 \h </w:instrText>
+            </w:r>
+            <w:r>
+              <w:rPr>
+                <w:noProof/>
+                <w:webHidden/>
+              </w:rPr>
+            </w:r>
+            <w:r>
+              <w:rPr>
+                <w:noProof/>
+                <w:webHidden/>
+              </w:rPr>
+              <w:fldChar w:fldCharType="separate"/>
+            </w:r>
+            <w:r>
+              <w:rPr>
+                <w:noProof/>
+                <w:webHidden/>
+              </w:rPr>
+              <w:t>7</w:t>
+            </w:r>
+            <w:r>
+              <w:rPr>
+                <w:noProof/>
+                <w:webHidden/>
+              </w:rPr>
+              <w:fldChar w:fldCharType="end"/>
+            </w:r>
+          </w:hyperlink>
+        </w:p>
+        <w:p>
+          <w:pPr>
+            <w:pStyle w:val="TDC2"/>
+            <w:tabs>
+              <w:tab w:val="right" w:leader="dot" w:pos="8828"/>
+            </w:tabs>
+            <w:rPr>
+              <w:rFonts w:eastAsiaTheme="minorEastAsia"/>
+              <w:noProof/>
+              <w:kern w:val="2"/>
+              <w:sz w:val="24"/>
+              <w:szCs w:val="24"/>
+              <w:lang w:eastAsia="es-CO"/>
+              <w14:ligatures w14:val="standardContextual"/>
+            </w:rPr>
+          </w:pPr>
+          <w:hyperlink w:anchor="_Toc226225158" w:history="1">
+            <w:r>
+              <w:rPr>
+                <w:rStyle w:val="Hipervnculo"/>
+                <w:b/>
+                <w:bCs/>
+                <w:noProof/>
+                <w:lang w:val="en-US"/>
+              </w:rPr>
+              <w:t>Bibliografia</w:t>
+            </w:r>
+            <w:r>
+              <w:rPr>
+                <w:noProof/>
+                <w:webHidden/>
+              </w:rPr>
+              <w:tab/>
+            </w:r>
+            <w:r>
+              <w:rPr>
+                <w:noProof/>
+                <w:webHidden/>
+              </w:rPr>
+              <w:fldChar w:fldCharType="begin"/>
+            </w:r>
+            <w:r>
+              <w:rPr>
+                <w:noProof/>
+                <w:webHidden/>
+              </w:rPr>
+              <w:instrText xml:space="preserve"> PAGEREF _Toc226225158 \h </w:instrText>
+            </w:r>
+            <w:r>
+              <w:rPr>
+                <w:noProof/>
+                <w:webHidden/>
+              </w:rPr>
+            </w:r>
+            <w:r>
+              <w:rPr>
+                <w:noProof/>
+                <w:webHidden/>
+              </w:rPr>
+              <w:fldChar w:fldCharType="separate"/>
+            </w:r>
+            <w:r>
+              <w:rPr>
+                <w:noProof/>
+                <w:webHidden/>
+              </w:rPr>
+              <w:t>8</w:t>
+            </w:r>
+            <w:r>
+              <w:rPr>
+                <w:noProof/>
+                <w:webHidden/>
+              </w:rPr>
+              <w:fldChar w:fldCharType="end"/>
+            </w:r>
+          </w:hyperlink>
+        </w:p>
+        <w:p>
+          <w:r>
+            <w:rPr>
+              <w:b/>
+              <w:bCs/>
+              <w:lang w:val="es-ES"/>
+            </w:rPr>
+            <w:fldChar w:fldCharType="end"/>
+          </w:r>
+        </w:p>
+      </w:sdtContent>
+    </w:sdt>
+    <w:p>
+      <w:pPr>
+        <w:rPr>
+          <w:rFonts w:ascii="Arial" w:hAnsi="Arial" w:cs="Arial"/>
+          <w:b/>
+          <w:bCs/>
+          <w:sz w:val="24"/>
+          <w:szCs w:val="24"/>
+        </w:rPr>
+      </w:pPr>
+    </w:p>
+    <w:p>
+      <w:pPr>
+        <w:jc w:val="center"/>
+        <w:rPr>
+          <w:rFonts w:ascii="Arial" w:hAnsi="Arial" w:cs="Arial"/>
+          <w:b/>
+          <w:bCs/>
+          <w:sz w:val="24"/>
+          <w:szCs w:val="24"/>
+        </w:rPr>
+      </w:pPr>
+    </w:p>
+    <w:p>
+      <w:pPr>
+        <w:jc w:val="center"/>
+        <w:rPr>
+          <w:rFonts w:ascii="Arial" w:hAnsi="Arial" w:cs="Arial"/>
+          <w:b/>
+          <w:bCs/>
+          <w:sz w:val="24"/>
+          <w:szCs w:val="24"/>
+        </w:rPr>
+      </w:pPr>
+    </w:p>
+    <w:p>
+      <w:pPr>
+        <w:jc w:val="center"/>
+        <w:rPr>
+          <w:rFonts w:ascii="Arial" w:hAnsi="Arial" w:cs="Arial"/>
+          <w:b/>
+          <w:bCs/>
+          <w:sz w:val="24"/>
+          <w:szCs w:val="24"/>
+        </w:rPr>
+      </w:pPr>
+    </w:p>
+    <w:p>
+      <w:pPr>
+        <w:jc w:val="center"/>
+        <w:rPr>
+          <w:rFonts w:ascii="Arial" w:hAnsi="Arial" w:cs="Arial"/>
+          <w:b/>
+          <w:bCs/>
+          <w:sz w:val="24"/>
+          <w:szCs w:val="24"/>
+        </w:rPr>
+      </w:pPr>
+    </w:p>
+    <w:p>
+      <w:pPr>
+        <w:jc w:val="center"/>
+        <w:rPr>
+          <w:rFonts w:ascii="Arial" w:hAnsi="Arial" w:cs="Arial"/>
+          <w:b/>
+          <w:bCs/>
+          <w:sz w:val="24"/>
+          <w:szCs w:val="24"/>
+        </w:rPr>
+      </w:pPr>
+    </w:p>
+    <w:p>
+      <w:pPr>
+        <w:jc w:val="center"/>
+        <w:rPr>
+          <w:rFonts w:ascii="Arial" w:hAnsi="Arial" w:cs="Arial"/>
+          <w:b/>
+          <w:bCs/>
+          <w:sz w:val="24"/>
+          <w:szCs w:val="24"/>
+        </w:rPr>
+      </w:pPr>
+    </w:p>
+    <w:p>
+      <w:pPr>
+        <w:jc w:val="center"/>
+        <w:rPr>
+          <w:rFonts w:ascii="Arial" w:hAnsi="Arial" w:cs="Arial"/>
+          <w:b/>
+          <w:bCs/>
+          <w:sz w:val="24"/>
+          <w:szCs w:val="24"/>
+        </w:rPr>
+      </w:pPr>
+    </w:p>
+    <w:p>
+      <w:pPr>
+        <w:jc w:val="center"/>
+        <w:rPr>
+          <w:rFonts w:ascii="Arial" w:hAnsi="Arial" w:cs="Arial"/>
+          <w:b/>
+          <w:bCs/>
+          <w:sz w:val="24"/>
+          <w:szCs w:val="24"/>
+        </w:rPr>
+      </w:pPr>
+    </w:p>
+    <w:p>
+      <w:pPr>
+        <w:jc w:val="center"/>
+        <w:rPr>
+          <w:rFonts w:ascii="Arial" w:hAnsi="Arial" w:cs="Arial"/>
+          <w:b/>
+          <w:bCs/>
+          <w:sz w:val="24"/>
+          <w:szCs w:val="24"/>
+        </w:rPr>
+      </w:pPr>
+    </w:p>
+    <w:p>
+      <w:pPr>
+        <w:jc w:val="center"/>
+        <w:rPr>
+          <w:rFonts w:ascii="Arial" w:hAnsi="Arial" w:cs="Arial"/>
+          <w:b/>
+          <w:bCs/>
+          <w:sz w:val="24"/>
+          <w:szCs w:val="24"/>
+        </w:rPr>
+      </w:pPr>
+    </w:p>
+    <w:p>
+      <w:pPr>
+        <w:jc w:val="center"/>
+        <w:rPr>
+          <w:rFonts w:ascii="Arial" w:hAnsi="Arial" w:cs="Arial"/>
+          <w:b/>
+          <w:bCs/>
+          <w:sz w:val="24"/>
+          <w:szCs w:val="24"/>
+        </w:rPr>
+      </w:pPr>
+    </w:p>
+    <w:p>
+      <w:pPr>
+        <w:rPr>
+          <w:rFonts w:ascii="Arial" w:hAnsi="Arial" w:cs="Arial"/>
+          <w:b/>
+          <w:bCs/>
+          <w:sz w:val="24"/>
+          <w:szCs w:val="24"/>
+        </w:rPr>
+      </w:pPr>
+    </w:p>
+    <w:p>
+      <w:pPr>
+        <w:jc w:val="center"/>
+        <w:rPr>
+          <w:rFonts w:ascii="Arial" w:hAnsi="Arial" w:cs="Arial"/>
+          <w:b/>
+          <w:bCs/>
+          <w:sz w:val="24"/>
+          <w:szCs w:val="24"/>
+        </w:rPr>
+      </w:pPr>
+    </w:p>
     <w:p>
       <w:pPr>
         <w:pStyle w:val="Ttulo2"/>
-      </w:pPr>
-      <w:r>
+        <w:rPr>
+          <w:b/>
+          <w:bCs/>
+        </w:rPr>
+      </w:pPr>
+      <w:bookmarkStart w:id="0" w:name="_Toc226225147"/>
+      <w:r>
+        <w:rPr>
+          <w:b/>
+          <w:bCs/>
+        </w:rPr>
         <w:lastRenderedPageBreak/>
         <w:t>Introducción al análisis de base de datos</w:t>
       </w:r>
+      <w:bookmarkEnd w:id="0"/>
     </w:p>
     <w:p>
       <w:pPr>
@@ -468,23 +1601,7 @@
           <w:sz w:val="24"/>
           <w:szCs w:val="24"/>
         </w:rPr>
-        <w:t xml:space="preserve">Además, la base de datos debe permitir un acceso rápido y seguro a la información, facilitando tanto la consulta como la actualización de los datos por parte del sistema. También es importante que </w:t>
-      </w:r>
-      <w:r>
-        <w:rPr>
-          <w:rFonts w:ascii="Arial" w:hAnsi="Arial" w:cs="Arial"/>
-          <w:sz w:val="24"/>
-          <w:szCs w:val="24"/>
-        </w:rPr>
-        <w:t>soportes múltiples</w:t>
-      </w:r>
-      <w:r>
-        <w:rPr>
-          <w:rFonts w:ascii="Arial" w:hAnsi="Arial" w:cs="Arial"/>
-          <w:sz w:val="24"/>
-          <w:szCs w:val="24"/>
-        </w:rPr>
-        <w:t xml:space="preserve"> usuarios de manera simultánea, garantizando que las transacciones se realicen correctamente sin generar inconsistencias en la información. Por esta razón, se requiere una solución que ofrezca escalabilidad, seguridad y buen rendimiento, asegurando que la plataforma pueda crecer y adaptarse a las necesidades del sistema a medida que aumente el número de usuarios y la cantidad de información almacenada.</w:t>
+        <w:t>Además, la base de datos debe permitir un acceso rápido y seguro a la información, facilitando tanto la consulta como la actualización de los datos por parte del sistema. También es importante que soportes múltiples usuarios de manera simultánea, garantizando que las transacciones se realicen correctamente sin generar inconsistencias en la información. Por esta razón, se requiere una solución que ofrezca escalabilidad, seguridad y buen rendimiento, asegurando que la plataforma pueda crecer y adaptarse a las necesidades del sistema a medida que aumente el número de usuarios y la cantidad de información almacenada.</w:t>
       </w:r>
     </w:p>
     <w:p>
@@ -500,10 +1617,20 @@
     <w:p>
       <w:pPr>
         <w:pStyle w:val="Ttulo2"/>
-      </w:pPr>
-      <w:r>
+        <w:rPr>
+          <w:b/>
+          <w:bCs/>
+        </w:rPr>
+      </w:pPr>
+      <w:bookmarkStart w:id="1" w:name="_Toc226225148"/>
+      <w:r>
+        <w:rPr>
+          <w:b/>
+          <w:bCs/>
+        </w:rPr>
         <w:t>Requerimientos de datos del sistema</w:t>
       </w:r>
+      <w:bookmarkEnd w:id="1"/>
     </w:p>
     <w:p>
       <w:pPr>
@@ -829,6 +1956,8 @@
         <w:jc w:val="both"/>
         <w:rPr>
           <w:rFonts w:asciiTheme="majorHAnsi" w:eastAsiaTheme="majorEastAsia" w:hAnsiTheme="majorHAnsi" w:cstheme="majorBidi"/>
+          <w:b/>
+          <w:bCs/>
           <w:color w:val="0F4761" w:themeColor="accent1" w:themeShade="BF"/>
           <w:sz w:val="32"/>
           <w:szCs w:val="32"/>
@@ -837,39 +1966,14 @@
       <w:r>
         <w:rPr>
           <w:rFonts w:asciiTheme="majorHAnsi" w:eastAsiaTheme="majorEastAsia" w:hAnsiTheme="majorHAnsi" w:cstheme="majorBidi"/>
+          <w:b/>
+          <w:bCs/>
           <w:color w:val="0F4761" w:themeColor="accent1" w:themeShade="BF"/>
           <w:sz w:val="32"/>
           <w:szCs w:val="32"/>
         </w:rPr>
         <w:lastRenderedPageBreak/>
-        <w:t>Tipo de base</w:t>
-      </w:r>
-      <w:r>
-        <w:rPr>
-          <w:rFonts w:asciiTheme="majorHAnsi" w:eastAsiaTheme="majorEastAsia" w:hAnsiTheme="majorHAnsi" w:cstheme="majorBidi"/>
-          <w:color w:val="0F4761" w:themeColor="accent1" w:themeShade="BF"/>
-          <w:sz w:val="32"/>
-          <w:szCs w:val="32"/>
-        </w:rPr>
-        <w:t>s</w:t>
-      </w:r>
-      <w:r>
-        <w:rPr>
-          <w:rFonts w:asciiTheme="majorHAnsi" w:eastAsiaTheme="majorEastAsia" w:hAnsiTheme="majorHAnsi" w:cstheme="majorBidi"/>
-          <w:color w:val="0F4761" w:themeColor="accent1" w:themeShade="BF"/>
-          <w:sz w:val="32"/>
-          <w:szCs w:val="32"/>
-        </w:rPr>
-        <w:t xml:space="preserve"> de datos evaluada</w:t>
-      </w:r>
-      <w:r>
-        <w:rPr>
-          <w:rFonts w:asciiTheme="majorHAnsi" w:eastAsiaTheme="majorEastAsia" w:hAnsiTheme="majorHAnsi" w:cstheme="majorBidi"/>
-          <w:color w:val="0F4761" w:themeColor="accent1" w:themeShade="BF"/>
-          <w:sz w:val="32"/>
-          <w:szCs w:val="32"/>
-        </w:rPr>
-        <w:t>s</w:t>
+        <w:t>Tipo de bases de datos evaluadas</w:t>
       </w:r>
     </w:p>
     <w:p>
@@ -1028,25 +2132,13 @@
     </w:p>
     <w:p>
       <w:pPr>
-        <w:pStyle w:val="Prrafodelista"/>
-        <w:numPr>
-          <w:ilvl w:val="0"/>
-          <w:numId w:val="9"/>
-        </w:numPr>
-        <w:rPr>
-          <w:rFonts w:ascii="Arial" w:hAnsi="Arial" w:cs="Arial"/>
-          <w:sz w:val="24"/>
-          <w:szCs w:val="24"/>
-        </w:rPr>
-      </w:pPr>
-      <w:r>
-        <w:rPr>
-          <w:rFonts w:ascii="Arial" w:hAnsi="Arial" w:cs="Arial"/>
-          <w:sz w:val="24"/>
-          <w:szCs w:val="24"/>
-        </w:rPr>
+        <w:pStyle w:val="Ttulo3"/>
+      </w:pPr>
+      <w:bookmarkStart w:id="2" w:name="_Toc226225149"/>
+      <w:r>
         <w:t>PostgreSQL</w:t>
       </w:r>
+      <w:bookmarkEnd w:id="2"/>
     </w:p>
     <w:p>
       <w:pPr>
@@ -1077,25 +2169,13 @@
     </w:p>
     <w:p>
       <w:pPr>
-        <w:pStyle w:val="Prrafodelista"/>
-        <w:numPr>
-          <w:ilvl w:val="0"/>
-          <w:numId w:val="9"/>
-        </w:numPr>
-        <w:rPr>
-          <w:rFonts w:ascii="Arial" w:hAnsi="Arial" w:cs="Arial"/>
-          <w:sz w:val="24"/>
-          <w:szCs w:val="24"/>
-        </w:rPr>
-      </w:pPr>
-      <w:r>
-        <w:rPr>
-          <w:rFonts w:ascii="Arial" w:hAnsi="Arial" w:cs="Arial"/>
-          <w:sz w:val="24"/>
-          <w:szCs w:val="24"/>
-        </w:rPr>
+        <w:pStyle w:val="Ttulo3"/>
+      </w:pPr>
+      <w:bookmarkStart w:id="3" w:name="_Toc226225150"/>
+      <w:r>
         <w:t>MySQL</w:t>
       </w:r>
+      <w:bookmarkEnd w:id="3"/>
     </w:p>
     <w:p>
       <w:pPr>
@@ -1126,26 +2206,14 @@
     </w:p>
     <w:p>
       <w:pPr>
-        <w:pStyle w:val="Prrafodelista"/>
-        <w:numPr>
-          <w:ilvl w:val="0"/>
-          <w:numId w:val="9"/>
-        </w:numPr>
-        <w:rPr>
-          <w:rFonts w:ascii="Arial" w:hAnsi="Arial" w:cs="Arial"/>
-          <w:sz w:val="24"/>
-          <w:szCs w:val="24"/>
-        </w:rPr>
-      </w:pPr>
+        <w:pStyle w:val="Ttulo3"/>
+      </w:pPr>
+      <w:bookmarkStart w:id="4" w:name="_Toc226225151"/>
       <w:proofErr w:type="spellStart"/>
       <w:r>
-        <w:rPr>
-          <w:rFonts w:ascii="Arial" w:hAnsi="Arial" w:cs="Arial"/>
-          <w:sz w:val="24"/>
-          <w:szCs w:val="24"/>
-        </w:rPr>
         <w:t>MariaDB</w:t>
       </w:r>
+      <w:bookmarkEnd w:id="4"/>
       <w:proofErr w:type="spellEnd"/>
     </w:p>
     <w:p>
@@ -1195,25 +2263,13 @@
     </w:p>
     <w:p>
       <w:pPr>
-        <w:pStyle w:val="Prrafodelista"/>
-        <w:numPr>
-          <w:ilvl w:val="0"/>
-          <w:numId w:val="9"/>
-        </w:numPr>
-        <w:rPr>
-          <w:rFonts w:ascii="Arial" w:hAnsi="Arial" w:cs="Arial"/>
-          <w:sz w:val="24"/>
-          <w:szCs w:val="24"/>
-        </w:rPr>
-      </w:pPr>
-      <w:r>
-        <w:rPr>
-          <w:rFonts w:ascii="Arial" w:hAnsi="Arial" w:cs="Arial"/>
-          <w:sz w:val="24"/>
-          <w:szCs w:val="24"/>
-        </w:rPr>
+        <w:pStyle w:val="Ttulo3"/>
+      </w:pPr>
+      <w:bookmarkStart w:id="5" w:name="_Toc226225152"/>
+      <w:r>
         <w:t>MongoDB</w:t>
       </w:r>
+      <w:bookmarkEnd w:id="5"/>
     </w:p>
     <w:p>
       <w:pPr>
@@ -1262,34 +2318,17 @@
     </w:p>
     <w:p>
       <w:pPr>
-        <w:pStyle w:val="Prrafodelista"/>
-        <w:numPr>
-          <w:ilvl w:val="0"/>
-          <w:numId w:val="9"/>
-        </w:numPr>
-        <w:rPr>
-          <w:rFonts w:ascii="Arial" w:hAnsi="Arial" w:cs="Arial"/>
-          <w:sz w:val="24"/>
-          <w:szCs w:val="24"/>
-        </w:rPr>
-      </w:pPr>
-      <w:r>
-        <w:rPr>
-          <w:rFonts w:ascii="Arial" w:hAnsi="Arial" w:cs="Arial"/>
-          <w:sz w:val="24"/>
-          <w:szCs w:val="24"/>
-        </w:rPr>
+        <w:pStyle w:val="Ttulo3"/>
+      </w:pPr>
+      <w:bookmarkStart w:id="6" w:name="_Toc226225153"/>
+      <w:r>
         <w:t xml:space="preserve">Oracle </w:t>
       </w:r>
       <w:proofErr w:type="spellStart"/>
       <w:r>
-        <w:rPr>
-          <w:rFonts w:ascii="Arial" w:hAnsi="Arial" w:cs="Arial"/>
-          <w:sz w:val="24"/>
-          <w:szCs w:val="24"/>
-        </w:rPr>
         <w:t>Database</w:t>
       </w:r>
+      <w:bookmarkEnd w:id="6"/>
       <w:proofErr w:type="spellEnd"/>
     </w:p>
     <w:p>
@@ -1339,25 +2378,13 @@
     </w:p>
     <w:p>
       <w:pPr>
-        <w:pStyle w:val="Prrafodelista"/>
-        <w:numPr>
-          <w:ilvl w:val="0"/>
-          <w:numId w:val="9"/>
-        </w:numPr>
-        <w:rPr>
-          <w:rFonts w:ascii="Arial" w:hAnsi="Arial" w:cs="Arial"/>
-          <w:sz w:val="24"/>
-          <w:szCs w:val="24"/>
-        </w:rPr>
-      </w:pPr>
-      <w:r>
-        <w:rPr>
-          <w:rFonts w:ascii="Arial" w:hAnsi="Arial" w:cs="Arial"/>
-          <w:sz w:val="24"/>
-          <w:szCs w:val="24"/>
-        </w:rPr>
+        <w:pStyle w:val="Ttulo3"/>
+      </w:pPr>
+      <w:bookmarkStart w:id="7" w:name="_Toc226225154"/>
+      <w:r>
         <w:t>SQLite</w:t>
       </w:r>
+      <w:bookmarkEnd w:id="7"/>
     </w:p>
     <w:p>
       <w:pPr>
@@ -1471,14 +2498,79 @@
     </w:p>
     <w:p>
       <w:pPr>
+        <w:jc w:val="both"/>
+        <w:rPr>
+          <w:rFonts w:ascii="Arial" w:hAnsi="Arial" w:cs="Arial"/>
+          <w:sz w:val="24"/>
+          <w:szCs w:val="24"/>
+        </w:rPr>
+      </w:pPr>
+    </w:p>
+    <w:p>
+      <w:pPr>
+        <w:jc w:val="both"/>
+        <w:rPr>
+          <w:rFonts w:ascii="Arial" w:hAnsi="Arial" w:cs="Arial"/>
+          <w:sz w:val="24"/>
+          <w:szCs w:val="24"/>
+        </w:rPr>
+      </w:pPr>
+    </w:p>
+    <w:p>
+      <w:pPr>
+        <w:jc w:val="both"/>
+        <w:rPr>
+          <w:rFonts w:ascii="Arial" w:hAnsi="Arial" w:cs="Arial"/>
+          <w:sz w:val="24"/>
+          <w:szCs w:val="24"/>
+        </w:rPr>
+      </w:pPr>
+    </w:p>
+    <w:p>
+      <w:pPr>
+        <w:jc w:val="both"/>
+        <w:rPr>
+          <w:rFonts w:ascii="Arial" w:hAnsi="Arial" w:cs="Arial"/>
+          <w:sz w:val="24"/>
+          <w:szCs w:val="24"/>
+        </w:rPr>
+      </w:pPr>
+    </w:p>
+    <w:p>
+      <w:pPr>
+        <w:jc w:val="both"/>
+        <w:rPr>
+          <w:rFonts w:ascii="Arial" w:hAnsi="Arial" w:cs="Arial"/>
+          <w:sz w:val="24"/>
+          <w:szCs w:val="24"/>
+        </w:rPr>
+      </w:pPr>
+    </w:p>
+    <w:p>
+      <w:pPr>
         <w:pStyle w:val="Ttulo2"/>
-      </w:pPr>
-      <w:r>
+        <w:rPr>
+          <w:b/>
+          <w:bCs/>
+        </w:rPr>
+      </w:pPr>
+      <w:bookmarkStart w:id="8" w:name="_Toc226225155"/>
+      <w:r>
+        <w:rPr>
+          <w:b/>
+          <w:bCs/>
+        </w:rPr>
+        <w:lastRenderedPageBreak/>
         <w:t>Matriz</w:t>
       </w:r>
       <w:r>
+        <w:rPr>
+          <w:b/>
+          <w:bCs/>
+        </w:rPr>
         <w:t xml:space="preserve"> de comparación</w:t>
       </w:r>
+      <w:bookmarkEnd w:id="8"/>
     </w:p>
     <w:tbl>
       <w:tblPr>
@@ -2150,7 +3242,6 @@
                 <w:color w:val="000000"/>
                 <w:lang w:eastAsia="es-CO"/>
               </w:rPr>
-              <w:lastRenderedPageBreak/>
               <w:t>Soporte para transacciones</w:t>
             </w:r>
           </w:p>
@@ -3391,11 +4482,42 @@
     </w:p>
     <w:p>
       <w:pPr>
+        <w:jc w:val="both"/>
+        <w:rPr>
+          <w:rFonts w:ascii="Arial" w:hAnsi="Arial" w:cs="Arial"/>
+          <w:sz w:val="24"/>
+          <w:szCs w:val="24"/>
+        </w:rPr>
+      </w:pPr>
+    </w:p>
+    <w:p>
+      <w:pPr>
+        <w:jc w:val="both"/>
+        <w:rPr>
+          <w:rFonts w:ascii="Arial" w:hAnsi="Arial" w:cs="Arial"/>
+          <w:sz w:val="24"/>
+          <w:szCs w:val="24"/>
+        </w:rPr>
+      </w:pPr>
+    </w:p>
+    <w:p>
+      <w:pPr>
         <w:pStyle w:val="Ttulo2"/>
-      </w:pPr>
-      <w:r>
+        <w:rPr>
+          <w:b/>
+          <w:bCs/>
+        </w:rPr>
+      </w:pPr>
+      <w:bookmarkStart w:id="9" w:name="_Toc226225156"/>
+      <w:r>
+        <w:rPr>
+          <w:b/>
+          <w:bCs/>
+        </w:rPr>
+        <w:lastRenderedPageBreak/>
         <w:t>Selección de la base de datos</w:t>
       </w:r>
+      <w:bookmarkEnd w:id="9"/>
     </w:p>
     <w:p>
       <w:pPr>
@@ -3474,10 +4596,22 @@
     <w:p>
       <w:pPr>
         <w:pStyle w:val="Ttulo3"/>
-      </w:pPr>
-      <w:r>
+        <w:rPr>
+          <w:rFonts w:asciiTheme="majorHAnsi" w:hAnsiTheme="majorHAnsi"/>
+          <w:b/>
+          <w:bCs/>
+        </w:rPr>
+      </w:pPr>
+      <w:bookmarkStart w:id="10" w:name="_Toc226225157"/>
+      <w:r>
+        <w:rPr>
+          <w:rFonts w:asciiTheme="majorHAnsi" w:hAnsiTheme="majorHAnsi"/>
+          <w:b/>
+          <w:bCs/>
+        </w:rPr>
         <w:t>Características de elección de PostgreSQL</w:t>
       </w:r>
+      <w:bookmarkEnd w:id="10"/>
     </w:p>
     <w:p>
       <w:pPr>
@@ -3520,7 +4654,6 @@
           <w:sz w:val="24"/>
           <w:szCs w:val="24"/>
         </w:rPr>
-        <w:lastRenderedPageBreak/>
         <w:t>PostgreSQL esta optimizado para realizar consultas complejas y realizar transacciones al mismo tiempo, lo que permite que la aplicación funcione incluso en condiciones de tráfico múltiple de usuarios</w:t>
       </w:r>
       <w:r>
@@ -3600,15 +4733,7 @@
           <w:sz w:val="24"/>
           <w:szCs w:val="24"/>
         </w:rPr>
-        <w:t xml:space="preserve"> </w:t>
-      </w:r>
-      <w:r>
-        <w:rPr>
-          <w:rFonts w:ascii="Arial" w:hAnsi="Arial" w:cs="Arial"/>
-          <w:sz w:val="24"/>
-          <w:szCs w:val="24"/>
-        </w:rPr>
-        <w:t>[2</w:t>
+        <w:t xml:space="preserve"> [2</w:t>
       </w:r>
       <w:proofErr w:type="gramStart"/>
       <w:r>
@@ -3724,15 +4849,7 @@
           <w:sz w:val="24"/>
           <w:szCs w:val="24"/>
         </w:rPr>
-        <w:t xml:space="preserve"> </w:t>
-      </w:r>
-      <w:r>
-        <w:rPr>
-          <w:rFonts w:ascii="Arial" w:hAnsi="Arial" w:cs="Arial"/>
-          <w:sz w:val="24"/>
-          <w:szCs w:val="24"/>
-        </w:rPr>
-        <w:t>[2].</w:t>
+        <w:t xml:space="preserve"> [2].</w:t>
       </w:r>
     </w:p>
     <w:p>
@@ -3805,15 +4922,7 @@
           <w:sz w:val="24"/>
           <w:szCs w:val="24"/>
         </w:rPr>
-        <w:t xml:space="preserve"> </w:t>
-      </w:r>
-      <w:r>
-        <w:rPr>
-          <w:rFonts w:ascii="Arial" w:hAnsi="Arial" w:cs="Arial"/>
-          <w:sz w:val="24"/>
-          <w:szCs w:val="24"/>
-        </w:rPr>
-        <w:t>[2]</w:t>
+        <w:t xml:space="preserve"> [2]</w:t>
       </w:r>
       <w:r>
         <w:rPr>
@@ -3886,15 +4995,7 @@
           <w:sz w:val="24"/>
           <w:szCs w:val="24"/>
         </w:rPr>
-        <w:t xml:space="preserve"> </w:t>
-      </w:r>
-      <w:r>
-        <w:rPr>
-          <w:rFonts w:ascii="Arial" w:hAnsi="Arial" w:cs="Arial"/>
-          <w:sz w:val="24"/>
-          <w:szCs w:val="24"/>
-        </w:rPr>
-        <w:t>[2]</w:t>
+        <w:t xml:space="preserve"> [2]</w:t>
       </w:r>
       <w:r>
         <w:rPr>
@@ -3927,155 +5028,42 @@
         </w:rPr>
       </w:pPr>
     </w:p>
-    <w:p/>
-    <w:p>
-      <w:pPr>
-        <w:jc w:val="both"/>
-        <w:rPr>
-          <w:rFonts w:ascii="Arial" w:hAnsi="Arial" w:cs="Arial"/>
-          <w:sz w:val="24"/>
-          <w:szCs w:val="24"/>
-        </w:rPr>
-      </w:pPr>
-    </w:p>
-    <w:p>
-      <w:pPr>
-        <w:jc w:val="both"/>
-        <w:rPr>
-          <w:rFonts w:ascii="Arial" w:hAnsi="Arial" w:cs="Arial"/>
-          <w:sz w:val="24"/>
-          <w:szCs w:val="24"/>
-        </w:rPr>
-      </w:pPr>
-    </w:p>
-    <w:p>
-      <w:pPr>
-        <w:jc w:val="both"/>
-        <w:rPr>
-          <w:rFonts w:ascii="Arial" w:eastAsiaTheme="majorEastAsia" w:hAnsi="Arial" w:cs="Arial"/>
-          <w:color w:val="0F4761" w:themeColor="accent1" w:themeShade="BF"/>
-          <w:sz w:val="24"/>
-          <w:szCs w:val="24"/>
-        </w:rPr>
-      </w:pPr>
-    </w:p>
-    <w:p>
-      <w:pPr>
-        <w:jc w:val="both"/>
-        <w:rPr>
-          <w:rFonts w:ascii="Arial" w:hAnsi="Arial" w:cs="Arial"/>
-          <w:sz w:val="24"/>
-          <w:szCs w:val="24"/>
-        </w:rPr>
-      </w:pPr>
-    </w:p>
-    <w:p>
-      <w:pPr>
-        <w:jc w:val="both"/>
-        <w:rPr>
-          <w:rFonts w:ascii="Arial" w:hAnsi="Arial" w:cs="Arial"/>
-          <w:sz w:val="24"/>
-          <w:szCs w:val="24"/>
-        </w:rPr>
-      </w:pPr>
-    </w:p>
-    <w:p>
-      <w:pPr>
-        <w:jc w:val="both"/>
-        <w:rPr>
-          <w:rFonts w:ascii="Arial" w:hAnsi="Arial" w:cs="Arial"/>
-          <w:sz w:val="24"/>
-          <w:szCs w:val="24"/>
-        </w:rPr>
-      </w:pPr>
-    </w:p>
-    <w:p>
-      <w:pPr>
-        <w:jc w:val="both"/>
-        <w:rPr>
-          <w:rFonts w:ascii="Arial" w:hAnsi="Arial" w:cs="Arial"/>
-          <w:sz w:val="24"/>
-          <w:szCs w:val="24"/>
-        </w:rPr>
-      </w:pPr>
-    </w:p>
-    <w:p>
-      <w:pPr>
-        <w:jc w:val="both"/>
-        <w:rPr>
-          <w:rFonts w:ascii="Arial" w:hAnsi="Arial" w:cs="Arial"/>
-          <w:sz w:val="24"/>
-          <w:szCs w:val="24"/>
-        </w:rPr>
-      </w:pPr>
-    </w:p>
-    <w:p>
-      <w:pPr>
-        <w:jc w:val="both"/>
-        <w:rPr>
-          <w:rFonts w:ascii="Arial" w:hAnsi="Arial" w:cs="Arial"/>
-          <w:sz w:val="24"/>
-          <w:szCs w:val="24"/>
-        </w:rPr>
-      </w:pPr>
-    </w:p>
-    <w:p>
-      <w:pPr>
-        <w:jc w:val="both"/>
-        <w:rPr>
-          <w:rFonts w:ascii="Arial" w:hAnsi="Arial" w:cs="Arial"/>
-          <w:sz w:val="24"/>
-          <w:szCs w:val="24"/>
-        </w:rPr>
-      </w:pPr>
-    </w:p>
-    <w:p>
-      <w:pPr>
-        <w:jc w:val="both"/>
-        <w:rPr>
-          <w:rFonts w:ascii="Arial" w:hAnsi="Arial" w:cs="Arial"/>
-          <w:sz w:val="24"/>
-          <w:szCs w:val="24"/>
-        </w:rPr>
-      </w:pPr>
-    </w:p>
-    <w:p>
-      <w:pPr>
-        <w:jc w:val="both"/>
-        <w:rPr>
-          <w:rFonts w:ascii="Arial" w:hAnsi="Arial" w:cs="Arial"/>
-          <w:sz w:val="24"/>
-          <w:szCs w:val="24"/>
-        </w:rPr>
-      </w:pPr>
-    </w:p>
-    <w:p>
-      <w:pPr>
-        <w:jc w:val="both"/>
-        <w:rPr>
-          <w:rFonts w:ascii="Arial" w:hAnsi="Arial" w:cs="Arial"/>
-          <w:sz w:val="24"/>
-          <w:szCs w:val="24"/>
-        </w:rPr>
-      </w:pPr>
-    </w:p>
-    <w:p>
-      <w:pPr>
-        <w:jc w:val="both"/>
-        <w:rPr>
-          <w:rFonts w:ascii="Arial" w:hAnsi="Arial" w:cs="Arial"/>
-          <w:sz w:val="24"/>
-          <w:szCs w:val="24"/>
-        </w:rPr>
-      </w:pPr>
-      <w:r>
-        <w:rPr>
-          <w:rFonts w:ascii="Arial" w:hAnsi="Arial" w:cs="Arial"/>
-          <w:sz w:val="24"/>
-          <w:szCs w:val="24"/>
-        </w:rPr>
-        <w:t>BIBLIOGRAFIA</w:t>
-      </w:r>
+    <w:p>
+      <w:pPr>
+        <w:pStyle w:val="Ttulo2"/>
+        <w:rPr>
+          <w:b/>
+          <w:bCs/>
+          <w:lang w:val="en-US"/>
+        </w:rPr>
+      </w:pPr>
+      <w:bookmarkStart w:id="11" w:name="_Toc226225158"/>
+      <w:r>
+        <w:rPr>
+          <w:b/>
+          <w:bCs/>
+          <w:lang w:val="en-US"/>
+        </w:rPr>
+        <w:lastRenderedPageBreak/>
+        <w:t>B</w:t>
+      </w:r>
+      <w:r>
+        <w:rPr>
+          <w:b/>
+          <w:bCs/>
+          <w:lang w:val="en-US"/>
+        </w:rPr>
+        <w:t>i</w:t>
+      </w:r>
+      <w:r>
+        <w:rPr>
+          <w:b/>
+          <w:bCs/>
+          <w:lang w:val="en-US"/>
+        </w:rPr>
+        <w:t>bliografia</w:t>
+      </w:r>
+      <w:bookmarkEnd w:id="11"/>
     </w:p>
     <w:p>
       <w:pPr>
@@ -4163,7 +5151,7 @@
         </w:rPr>
         <w:t xml:space="preserve">Disponible en: </w:t>
       </w:r>
-      <w:hyperlink r:id="rId7" w:tgtFrame="_new" w:history="1">
+      <w:hyperlink r:id="rId8" w:tgtFrame="_new" w:history="1">
         <w:r>
           <w:rPr>
             <w:rStyle w:val="Hipervnculo"/>
@@ -4278,7 +5266,7 @@
         </w:rPr>
         <w:t xml:space="preserve">. [En línea]. Disponible en: </w:t>
       </w:r>
-      <w:hyperlink r:id="rId8" w:tgtFrame="_new" w:history="1">
+      <w:hyperlink r:id="rId9" w:tgtFrame="_new" w:history="1">
         <w:r>
           <w:rPr>
             <w:rStyle w:val="Hipervnculo"/>
@@ -4308,7 +5296,7 @@
       </w:pPr>
     </w:p>
     <w:sectPr>
-      <w:headerReference w:type="default" r:id="rId9"/>
+      <w:headerReference w:type="default" r:id="rId10"/>
       <w:pgSz w:w="12240" w:h="15840"/>
       <w:pgMar w:top="1417" w:right="1701" w:bottom="1417" w:left="1701" w:header="708" w:footer="708" w:gutter="0"/>
       <w:cols w:space="708"/>
@@ -5996,6 +6984,7 @@
   <w:style w:type="character" w:default="1" w:styleId="Fuentedeprrafopredeter">
     <w:name w:val="Default Paragraph Font"/>
     <w:uiPriority w:val="1"/>
+    <w:semiHidden/>
     <w:unhideWhenUsed/>
   </w:style>
   <w:style w:type="table" w:default="1" w:styleId="Tablanormal">
@@ -6387,6 +7376,50 @@
       <w:shd w:val="clear" w:color="auto" w:fill="E1DFDD"/>
     </w:rPr>
   </w:style>
+  <w:style w:type="paragraph" w:styleId="TtuloTDC">
+    <w:name w:val="TOC Heading"/>
+    <w:basedOn w:val="Ttulo1"/>
+    <w:next w:val="Normal"/>
+    <w:uiPriority w:val="39"/>
+    <w:unhideWhenUsed/>
+    <w:qFormat/>
+    <w:rsid w:val="00F549CF"/>
+    <w:pPr>
+      <w:spacing w:before="240" w:after="0"/>
+      <w:outlineLvl w:val="9"/>
+    </w:pPr>
+    <w:rPr>
+      <w:sz w:val="32"/>
+      <w:szCs w:val="32"/>
+      <w:lang w:eastAsia="es-CO"/>
+    </w:rPr>
+  </w:style>
+  <w:style w:type="paragraph" w:styleId="TDC2">
+    <w:name w:val="toc 2"/>
+    <w:basedOn w:val="Normal"/>
+    <w:next w:val="Normal"/>
+    <w:autoRedefine/>
+    <w:uiPriority w:val="39"/>
+    <w:unhideWhenUsed/>
+    <w:rsid w:val="00F549CF"/>
+    <w:pPr>
+      <w:spacing w:after="100"/>
+      <w:ind w:left="220"/>
+    </w:pPr>
+  </w:style>
+  <w:style w:type="paragraph" w:styleId="TDC3">
+    <w:name w:val="toc 3"/>
+    <w:basedOn w:val="Normal"/>
+    <w:next w:val="Normal"/>
+    <w:autoRedefine/>
+    <w:uiPriority w:val="39"/>
+    <w:unhideWhenUsed/>
+    <w:rsid w:val="00F549CF"/>
+    <w:pPr>
+      <w:spacing w:after="100"/>
+      <w:ind w:left="440"/>
+    </w:pPr>
+  </w:style>
 </w:styles>
 </file>
 
@@ -6683,4 +7716,16 @@
     </a:ext>
   </a:extLst>
 </a:theme>
+</file>
+
+<file path=customXml/item1.xml><?xml version="1.0" encoding="utf-8"?>
+<b:Sources xmlns:b="http://schemas.openxmlformats.org/officeDocument/2006/bibliography" xmlns="http://schemas.openxmlformats.org/officeDocument/2006/bibliography" SelectedStyle="\APASixthEditionOfficeOnline.xsl" StyleName="APA" Version="6"/>
+</file>
+
+<file path=customXml/itemProps1.xml><?xml version="1.0" encoding="utf-8"?>
+<ds:datastoreItem xmlns:ds="http://schemas.openxmlformats.org/officeDocument/2006/customXml" ds:itemID="{838B3DBA-DCF5-4355-851E-47F87F70D5C8}">
+  <ds:schemaRefs>
+    <ds:schemaRef ds:uri="http://schemas.openxmlformats.org/officeDocument/2006/bibliography"/>
+  </ds:schemaRefs>
+</ds:datastoreItem>
 </file>
</xml_diff>